<commit_message>
DIP-19: Align schema roles and verification with mobile web requirements
</commit_message>
<xml_diff>
--- a/docs/ai-module-design.docx
+++ b/docs/ai-module-design.docx
@@ -997,7 +997,7 @@
           <w:sz w:val="24"/>
           <w:szCs w:val="24"/>
         </w:rPr>
-        <w:t xml:space="preserve"/>
+        <w:t>Preview and confirmation: store the private draft in ai_proposals with its base version and validation result. Show the proposed days and cost impact. Only explicit confirmation after fresh permission, version and constraint checks saves the shared itinerary atomically and notifies participants. Cancel preserves the current plan.</w:t>
       </w:r>
       <w:r>
         <w:rPr>
@@ -1007,17 +1007,15 @@
           <w:sz w:val="24"/>
           <w:szCs w:val="24"/>
         </w:rPr>
-        <w:t xml:space="preserve">Saving:</w:t>
-      </w:r>
-      <w:r>
-        <w:rPr>
-          <w:rFonts w:ascii="Times New Roman" w:cs="Times New Roman" w:eastAsia="Times New Roman" w:hAnsi="Times New Roman"/>
-          <w:b w:val="false"/>
-          <w:bCs w:val="false"/>
-          <w:sz w:val="24"/>
-          <w:szCs w:val="24"/>
-        </w:rPr>
-        <w:t xml:space="preserve"> the plan is saved in the database and immediately appears for all participants.</w:t>
+      </w:r>
+      <w:r>
+        <w:rPr>
+          <w:rFonts w:ascii="Times New Roman" w:cs="Times New Roman" w:eastAsia="Times New Roman" w:hAnsi="Times New Roman"/>
+          <w:b w:val="false"/>
+          <w:bCs w:val="false"/>
+          <w:sz w:val="24"/>
+          <w:szCs w:val="24"/>
+        </w:rPr>
       </w:r>
     </w:p>
     <w:p>

</xml_diff>